<commit_message>
Sync Equations-at-a-Glance handout and KDP blurb with the corrected manuscript
The main manuscript already had a full editorial pass applied (physics
fixes, epigraph rewrite, prose-tic sweep) and Appendix A inside
14_Back_Matter.md reflects it, but two reader-facing files that mirror
that content were never updated to match:

- "Equations at a Glance.docx" (the standalone handout) still had the
  pre-fix covariant derivative (wrong sign, missing the /c factor) and
  the wrong g-2 precision claim ("one part in a trillion" instead of
  the correct "one part in a billion"), plus 11 of its 12 chapter
  cross-references pointed at an old chapter-numbering scheme.
- kdp_description_QC.txt (the Amazon sales copy) repeated the same
  g-2 "one part in a trillion" overstatement.

Both now match the corrected Appendix A and chapter numbering.

Co-Authored-By: Claude Sonnet 5 <noreply@anthropic.com>
Claude-Session: https://claude.ai/code/session_017RTKmmeaJYeERS7w6BqdBQ
</commit_message>
<xml_diff>
--- a/Science Books/The Quantum Conversation/Equations at a Glance.docx
+++ b/Science Books/The Quantum Conversation/Equations at a Glance.docx
@@ -137,7 +137,7 @@
           <w:sz w:val="20"/>
           <w:szCs w:val="20"/>
         </w:rPr>
-        <w:t xml:space="preserve">  —  Maxwell's equations (Chapter 17):</w:t>
+        <w:t xml:space="preserve">  —  Maxwell's equations (Chapter 13):</w:t>
       </w:r>
     </w:p>
     <w:p>
@@ -251,7 +251,7 @@
           <w:sz w:val="20"/>
           <w:szCs w:val="20"/>
         </w:rPr>
-        <w:t xml:space="preserve">  —  Electromagnetic energy density and flux (Chapters 23–24):</w:t>
+        <w:t xml:space="preserve">  —  Electromagnetic energy density and flux (Chapters 18–19):</w:t>
       </w:r>
     </w:p>
     <w:p>
@@ -333,7 +333,7 @@
           <w:sz w:val="20"/>
           <w:szCs w:val="20"/>
         </w:rPr>
-        <w:t xml:space="preserve">  —  Photon energy and momentum (Chapter 25):</w:t>
+        <w:t xml:space="preserve">  —  Photon energy and momentum (Chapter 19):</w:t>
       </w:r>
     </w:p>
     <w:p>
@@ -415,7 +415,7 @@
           <w:sz w:val="20"/>
           <w:szCs w:val="20"/>
         </w:rPr>
-        <w:t xml:space="preserve">  —  The Lorentz force (Chapter 32):</w:t>
+        <w:t xml:space="preserve">  —  The Lorentz force (Chapter 25):</w:t>
       </w:r>
     </w:p>
     <w:p>
@@ -481,7 +481,7 @@
           <w:sz w:val="20"/>
           <w:szCs w:val="20"/>
         </w:rPr>
-        <w:t xml:space="preserve">  —  The covariant derivative (Chapter 36):</w:t>
+        <w:t xml:space="preserve">  —  The covariant derivative (Chapter 28):</w:t>
       </w:r>
     </w:p>
     <w:p>
@@ -539,7 +539,7 @@
           <w:sz w:val="24"/>
           <w:szCs w:val="24"/>
         </w:rPr>
-        <w:t xml:space="preserve"> + (iq/ħ)A</w:t>
+        <w:t xml:space="preserve"> − (iq/(ħc))A</w:t>
       </w:r>
       <w:r>
         <w:rPr>
@@ -600,7 +600,7 @@
           <w:sz w:val="20"/>
           <w:szCs w:val="20"/>
         </w:rPr>
-        <w:t xml:space="preserve">  —  The Coulomb potential and force (Chapter 38):</w:t>
+        <w:t xml:space="preserve">  —  The Coulomb potential energy and force (Chapter 30):</w:t>
       </w:r>
     </w:p>
     <w:p>
@@ -682,7 +682,7 @@
           <w:sz w:val="20"/>
           <w:szCs w:val="20"/>
         </w:rPr>
-        <w:t xml:space="preserve">  —  The book's central equation (Chapter 41):</w:t>
+        <w:t xml:space="preserve">  —  The book's central bridge (Chapter 32):</w:t>
       </w:r>
     </w:p>
     <w:p>
@@ -748,7 +748,7 @@
           <w:sz w:val="20"/>
           <w:szCs w:val="20"/>
         </w:rPr>
-        <w:t xml:space="preserve">  —  The Wilson loop (Chapter 43):</w:t>
+        <w:t xml:space="preserve">  —  The Wilson loop (Chapter 35):</w:t>
       </w:r>
     </w:p>
     <w:p>
@@ -835,7 +835,7 @@
           <w:sz w:val="20"/>
           <w:szCs w:val="20"/>
         </w:rPr>
-        <w:t xml:space="preserve">  —  The electron's anomalous magnetic moment (Chapter 46):</w:t>
+        <w:t xml:space="preserve">  —  The electron's anomalous magnetic moment (Chapter 37):</w:t>
       </w:r>
     </w:p>
     <w:p>
@@ -894,7 +894,7 @@
           <w:sz w:val="24"/>
           <w:szCs w:val="24"/>
         </w:rPr>
-        <w:t xml:space="preserve">QED's most precisely tested prediction, agreeing with experiment to better than one part in a trillion — the fingerprint of virtual quantum processes stamped directly onto a measurable number.</w:t>
+        <w:t xml:space="preserve">QED's most precisely tested prediction, agreeing with experiment to better than one part in a billion — the fingerprint of virtual quantum processes stamped directly onto a measurable number.</w:t>
       </w:r>
     </w:p>
     <w:p>
@@ -922,7 +922,7 @@
           <w:sz w:val="20"/>
           <w:szCs w:val="20"/>
         </w:rPr>
-        <w:t xml:space="preserve">  —  The fine-structure constant (Chapter 47):</w:t>
+        <w:t xml:space="preserve">  —  The fine-structure constant (Chapter 38):</w:t>
       </w:r>
     </w:p>
     <w:p>
@@ -988,7 +988,7 @@
           <w:sz w:val="20"/>
           <w:szCs w:val="20"/>
         </w:rPr>
-        <w:t xml:space="preserve">  —  The Josephson relations (Chapter 49):</w:t>
+        <w:t xml:space="preserve">  —  The Josephson relations (Chapter 40):</w:t>
       </w:r>
     </w:p>
     <w:p>

</xml_diff>

<commit_message>
Add the missing Josephson voltage-phase relation to Equations at a Glance
The standalone handout's Equation (12) only listed the current-phase and
energy-phase relations, omitting V = (ħ/2e) dδ/dt — the relation the book's
own back-matter Appendix A includes and calls out specifically ("a literal
voltmeter reading"). Added it as a third line ahead of the (12) label and
updated the one-line description to mention it, matching Appendix A.

Co-Authored-By: Claude Sonnet 5 <noreply@anthropic.com>
Claude-Session: https://claude.ai/code/session_01LKvCePgwWmT3RB8cjeYRtT
</commit_message>
<xml_diff>
--- a/Science Books/The Quantum Conversation/Equations at a Glance.docx
+++ b/Science Books/The Quantum Conversation/Equations at a Glance.docx
@@ -1064,6 +1064,22 @@
         </w:rPr>
         <w:t xml:space="preserve"> cos(δ)</w:t>
       </w:r>
+    </w:p>
+    <w:p>
+      <w:pPr>
+        <w:spacing w:after="300" w:before="60" w:line="360" w:lineRule="auto"/>
+        <w:jc w:val="center"/>
+      </w:pPr>
+      <w:r>
+        <w:rPr>
+          <w:rFonts w:ascii="Cambria Math" w:cs="Cambria Math" w:eastAsia="Cambria Math" w:hAnsi="Cambria Math"/>
+          <w:i/>
+          <w:iCs/>
+          <w:sz w:val="24"/>
+          <w:szCs w:val="24"/>
+        </w:rPr>
+        <w:t xml:space="preserve">V = (ħ/2e) dδ/dt</w:t>
+      </w:r>
       <w:r>
         <w:rPr>
           <w:rFonts w:ascii="Cambria" w:cs="Cambria" w:eastAsia="Cambria" w:hAnsi="Cambria"/>
@@ -1084,7 +1100,7 @@
           <w:sz w:val="24"/>
           <w:szCs w:val="24"/>
         </w:rPr>
-        <w:t xml:space="preserve">The equations that turn a quantum phase difference into a measurable current and a controllable, nonlinear energy — the working heart of every superconducting circuit this book describes.</w:t>
+        <w:t xml:space="preserve">The equations that turn a quantum phase difference into a measurable current, a controllable nonlinear energy, and — through the third relation — a literal voltmeter reading: together, the working heart of every superconducting circuit this book describes.</w:t>
       </w:r>
     </w:p>
     <w:sectPr>

</xml_diff>

<commit_message>
Add the missing Josephson voltage-phase relation to Equations at a Glance (#38)
The standalone handout's Equation (12) only listed the current-phase and
energy-phase relations, omitting V = (ħ/2e) dδ/dt — the relation the book's
own back-matter Appendix A includes and calls out specifically ("a literal
voltmeter reading"). Added it as a third line ahead of the (12) label and
updated the one-line description to mention it, matching Appendix A.


Claude-Session: https://claude.ai/code/session_01LKvCePgwWmT3RB8cjeYRtT

Co-authored-by: Claude <noreply@anthropic.com>
</commit_message>
<xml_diff>
--- a/Science Books/The Quantum Conversation/Equations at a Glance.docx
+++ b/Science Books/The Quantum Conversation/Equations at a Glance.docx
@@ -1064,6 +1064,22 @@
         </w:rPr>
         <w:t xml:space="preserve"> cos(δ)</w:t>
       </w:r>
+    </w:p>
+    <w:p>
+      <w:pPr>
+        <w:spacing w:after="300" w:before="60" w:line="360" w:lineRule="auto"/>
+        <w:jc w:val="center"/>
+      </w:pPr>
+      <w:r>
+        <w:rPr>
+          <w:rFonts w:ascii="Cambria Math" w:cs="Cambria Math" w:eastAsia="Cambria Math" w:hAnsi="Cambria Math"/>
+          <w:i/>
+          <w:iCs/>
+          <w:sz w:val="24"/>
+          <w:szCs w:val="24"/>
+        </w:rPr>
+        <w:t xml:space="preserve">V = (ħ/2e) dδ/dt</w:t>
+      </w:r>
       <w:r>
         <w:rPr>
           <w:rFonts w:ascii="Cambria" w:cs="Cambria" w:eastAsia="Cambria" w:hAnsi="Cambria"/>
@@ -1084,7 +1100,7 @@
           <w:sz w:val="24"/>
           <w:szCs w:val="24"/>
         </w:rPr>
-        <w:t xml:space="preserve">The equations that turn a quantum phase difference into a measurable current and a controllable, nonlinear energy — the working heart of every superconducting circuit this book describes.</w:t>
+        <w:t xml:space="preserve">The equations that turn a quantum phase difference into a measurable current, a controllable nonlinear energy, and — through the third relation — a literal voltmeter reading: together, the working heart of every superconducting circuit this book describes.</w:t>
       </w:r>
     </w:p>
     <w:sectPr>

</xml_diff>